<commit_message>
Implementadas las funcionalidades asociadas a la generación de las actas de útiles y herrmaientas con movimientos
</commit_message>
<xml_diff>
--- a/ActivosFijos/wwwroot/plantillas/Plantilla Acta Resp. Material Areas UTH.docx
+++ b/ActivosFijos/wwwroot/plantillas/Plantilla Acta Resp. Material Areas UTH.docx
@@ -17,23 +17,49 @@
           <w:b/>
           <w:u w:val="single"/>
         </w:rPr>
-        <w:t>ATI SANCTI SPIRITUS</w:t>
+        <w:t>MINISTERIO DE ENERGÍA Y MINAS</w:t>
       </w:r>
     </w:p>
     <w:p>
       <w:pPr>
         <w:jc w:val="center"/>
-        <w:rPr>
-          <w:rFonts w:ascii="Arial" w:hAnsi="Arial" w:cs="Arial"/>
-        </w:rPr>
-      </w:pPr>
-      <w:r>
         <w:rPr>
           <w:rFonts w:ascii="Arial" w:hAnsi="Arial" w:cs="Arial"/>
           <w:b/>
           <w:u w:val="single"/>
         </w:rPr>
+      </w:pPr>
+      <w:r>
+        <w:rPr>
+          <w:rFonts w:ascii="Arial" w:hAnsi="Arial" w:cs="Arial"/>
+          <w:b/>
+          <w:u w:val="single"/>
+        </w:rPr>
+        <w:t>UEB ATI Aplicaciones</w:t>
+      </w:r>
+    </w:p>
+    <w:p>
+      <w:pPr>
+        <w:jc w:val="center"/>
+        <w:rPr>
+          <w:rFonts w:ascii="Arial" w:hAnsi="Arial" w:cs="Arial"/>
+        </w:rPr>
+      </w:pPr>
+      <w:r>
+        <w:rPr>
+          <w:rFonts w:ascii="Arial" w:hAnsi="Arial" w:cs="Arial"/>
+          <w:b/>
+          <w:u w:val="single"/>
+        </w:rPr>
         <w:t>ACTA DE RESPONSABILIDAD MATERIAL UTILES Y HERRAMIENTAS</w:t>
+      </w:r>
+      <w:r>
+        <w:rPr>
+          <w:rFonts w:ascii="Arial" w:hAnsi="Arial" w:cs="Arial"/>
+          <w:b/>
+          <w:u w:val="single"/>
+        </w:rPr>
+        <w:t xml:space="preserve"> POR AREA</w:t>
       </w:r>
     </w:p>
     <w:p>
@@ -69,25 +95,7 @@
           <w:sz w:val="18"/>
           <w:szCs w:val="18"/>
         </w:rPr>
-        <w:t xml:space="preserve">quien </w:t>
-      </w:r>
-      <w:proofErr w:type="spellStart"/>
-      <w:r>
-        <w:rPr>
-          <w:rFonts w:ascii="Arial" w:hAnsi="Arial" w:cs="Arial"/>
-          <w:sz w:val="18"/>
-          <w:szCs w:val="18"/>
-        </w:rPr>
-        <w:t>ocupo</w:t>
-      </w:r>
-      <w:proofErr w:type="spellEnd"/>
-      <w:r>
-        <w:rPr>
-          <w:rFonts w:ascii="Arial" w:hAnsi="Arial" w:cs="Arial"/>
-          <w:sz w:val="18"/>
-          <w:szCs w:val="18"/>
-        </w:rPr>
-        <w:t xml:space="preserve"> el cargo de:</w:t>
+        <w:t>quien ocupo el cargo de:</w:t>
       </w:r>
       <w:r>
         <w:rPr>
@@ -105,16 +113,7 @@
           <w:sz w:val="18"/>
           <w:szCs w:val="18"/>
         </w:rPr>
-        <w:t xml:space="preserve"> y del Centro de </w:t>
-      </w:r>
-      <w:proofErr w:type="gramStart"/>
-      <w:r>
-        <w:rPr>
-          <w:rFonts w:ascii="Arial" w:hAnsi="Arial" w:cs="Arial"/>
-          <w:sz w:val="18"/>
-          <w:szCs w:val="18"/>
-        </w:rPr>
-        <w:t xml:space="preserve">Costo </w:t>
+        <w:t xml:space="preserve"> y del Centro de Costo </w:t>
       </w:r>
       <w:bookmarkStart w:id="2" w:name="CENTROCOSTO"/>
       <w:bookmarkEnd w:id="2"/>
@@ -124,16 +123,7 @@
           <w:sz w:val="18"/>
           <w:szCs w:val="18"/>
         </w:rPr>
-        <w:t xml:space="preserve"> me</w:t>
-      </w:r>
-      <w:proofErr w:type="gramEnd"/>
-      <w:r>
-        <w:rPr>
-          <w:rFonts w:ascii="Arial" w:hAnsi="Arial" w:cs="Arial"/>
-          <w:sz w:val="18"/>
-          <w:szCs w:val="18"/>
-        </w:rPr>
-        <w:t xml:space="preserve"> responsabilizo con la custodia de los útiles y herramientas, asignados a mí, los cuales se relacionan en el modelo Control de útiles y herramientas que obran en poder del Responsable del Área</w:t>
+        <w:t xml:space="preserve"> me responsabilizo con la custodia de los útiles y herramientas, asignados a mí, los cuales se relacionan en el modelo Control de útiles y herramientas que obran en poder del Responsable del Área</w:t>
       </w:r>
       <w:r>
         <w:rPr>
@@ -208,16 +198,7 @@
           <w:sz w:val="18"/>
           <w:szCs w:val="18"/>
         </w:rPr>
-        <w:t xml:space="preserve">A fin de que surta los efectos legales pertinentes firma la presente a </w:t>
-      </w:r>
-      <w:proofErr w:type="gramStart"/>
-      <w:r>
-        <w:rPr>
-          <w:rFonts w:ascii="Arial" w:hAnsi="Arial" w:cs="Arial"/>
-          <w:sz w:val="18"/>
-          <w:szCs w:val="18"/>
-        </w:rPr>
-        <w:t>los</w:t>
+        <w:t>A fin de que surta los efectos legales pertinentes firma la presente a los</w:t>
       </w:r>
       <w:r>
         <w:rPr>
@@ -243,16 +224,7 @@
           <w:sz w:val="18"/>
           <w:szCs w:val="18"/>
         </w:rPr>
-        <w:t>días</w:t>
-      </w:r>
-      <w:proofErr w:type="gramEnd"/>
-      <w:r>
-        <w:rPr>
-          <w:rFonts w:ascii="Arial" w:hAnsi="Arial" w:cs="Arial"/>
-          <w:sz w:val="18"/>
-          <w:szCs w:val="18"/>
-        </w:rPr>
-        <w:t xml:space="preserve"> del mes </w:t>
+        <w:t xml:space="preserve">días del mes </w:t>
       </w:r>
       <w:r>
         <w:rPr>

</xml_diff>

<commit_message>
Arreglos en la exportaciónde las actas asociadas a los UTHs
</commit_message>
<xml_diff>
--- a/ActivosFijos/wwwroot/plantillas/Plantilla Acta Resp. Material Areas UTH.docx
+++ b/ActivosFijos/wwwroot/plantillas/Plantilla Acta Resp. Material Areas UTH.docx
@@ -53,14 +53,6 @@
         </w:rPr>
         <w:t>ACTA DE RESPONSABILIDAD MATERIAL UTILES Y HERRAMIENTAS</w:t>
       </w:r>
-      <w:r>
-        <w:rPr>
-          <w:rFonts w:ascii="Arial" w:hAnsi="Arial" w:cs="Arial"/>
-          <w:b/>
-          <w:u w:val="single"/>
-        </w:rPr>
-        <w:t xml:space="preserve"> POR AREA</w:t>
-      </w:r>
     </w:p>
     <w:p>
       <w:pPr>
@@ -95,7 +87,25 @@
           <w:sz w:val="18"/>
           <w:szCs w:val="18"/>
         </w:rPr>
-        <w:t>quien ocupo el cargo de:</w:t>
+        <w:t xml:space="preserve">quien </w:t>
+      </w:r>
+      <w:proofErr w:type="spellStart"/>
+      <w:r>
+        <w:rPr>
+          <w:rFonts w:ascii="Arial" w:hAnsi="Arial" w:cs="Arial"/>
+          <w:sz w:val="18"/>
+          <w:szCs w:val="18"/>
+        </w:rPr>
+        <w:t>ocupo</w:t>
+      </w:r>
+      <w:proofErr w:type="spellEnd"/>
+      <w:r>
+        <w:rPr>
+          <w:rFonts w:ascii="Arial" w:hAnsi="Arial" w:cs="Arial"/>
+          <w:sz w:val="18"/>
+          <w:szCs w:val="18"/>
+        </w:rPr>
+        <w:t xml:space="preserve"> el cargo de:</w:t>
       </w:r>
       <w:r>
         <w:rPr>
@@ -303,39 +313,78 @@
     </w:p>
     <w:p>
       <w:pPr>
-        <w:jc w:val="both"/>
-        <w:rPr>
-          <w:rFonts w:ascii="Arial" w:hAnsi="Arial" w:cs="Arial"/>
-          <w:sz w:val="18"/>
-          <w:szCs w:val="18"/>
-        </w:rPr>
-      </w:pPr>
-      <w:r>
-        <w:rPr>
-          <w:rFonts w:ascii="Arial" w:hAnsi="Arial" w:cs="Arial"/>
-          <w:sz w:val="18"/>
-          <w:szCs w:val="18"/>
-        </w:rPr>
-        <w:t>Firma del Trabajador                                             Firma Responsable del Ár</w:t>
-      </w:r>
-      <w:r>
-        <w:rPr>
-          <w:rFonts w:ascii="Arial" w:hAnsi="Arial" w:cs="Arial"/>
-          <w:sz w:val="18"/>
-          <w:szCs w:val="18"/>
-        </w:rPr>
-        <w:t>ea</w:t>
-      </w:r>
-    </w:p>
-    <w:p>
-      <w:pPr>
+        <w:ind w:firstLine="708"/>
         <w:jc w:val="both"/>
         <w:rPr>
           <w:sz w:val="24"/>
           <w:szCs w:val="24"/>
         </w:rPr>
       </w:pPr>
-      <w:bookmarkStart w:id="8" w:name="FIRMATRABAJADOR"/>
+      <w:r>
+        <w:rPr>
+          <w:rFonts w:ascii="Arial" w:hAnsi="Arial" w:cs="Arial"/>
+          <w:sz w:val="18"/>
+          <w:szCs w:val="18"/>
+        </w:rPr>
+        <w:t xml:space="preserve">Firma de </w:t>
+      </w:r>
+      <w:r>
+        <w:rPr>
+          <w:rFonts w:ascii="Arial" w:hAnsi="Arial" w:cs="Arial"/>
+          <w:sz w:val="18"/>
+          <w:szCs w:val="18"/>
+        </w:rPr>
+        <w:t>Contabilidad</w:t>
+      </w:r>
+      <w:r>
+        <w:rPr>
+          <w:rFonts w:ascii="Arial" w:hAnsi="Arial" w:cs="Arial"/>
+          <w:sz w:val="18"/>
+          <w:szCs w:val="18"/>
+        </w:rPr>
+        <w:t xml:space="preserve">                                             Firma Responsable del Ár</w:t>
+      </w:r>
+      <w:r>
+        <w:rPr>
+          <w:rFonts w:ascii="Arial" w:hAnsi="Arial" w:cs="Arial"/>
+          <w:sz w:val="18"/>
+          <w:szCs w:val="18"/>
+        </w:rPr>
+        <w:t>ea</w:t>
+      </w:r>
+      <w:r>
+        <w:rPr>
+          <w:rFonts w:ascii="Arial" w:hAnsi="Arial" w:cs="Arial"/>
+          <w:sz w:val="18"/>
+          <w:szCs w:val="18"/>
+        </w:rPr>
+        <w:tab/>
+      </w:r>
+      <w:r>
+        <w:rPr>
+          <w:rFonts w:ascii="Arial" w:hAnsi="Arial" w:cs="Arial"/>
+          <w:sz w:val="18"/>
+          <w:szCs w:val="18"/>
+        </w:rPr>
+        <w:tab/>
+      </w:r>
+      <w:r>
+        <w:rPr>
+          <w:rFonts w:ascii="Arial" w:hAnsi="Arial" w:cs="Arial"/>
+          <w:sz w:val="18"/>
+          <w:szCs w:val="18"/>
+        </w:rPr>
+        <w:tab/>
+      </w:r>
+      <w:r>
+        <w:rPr>
+          <w:rFonts w:ascii="Arial" w:hAnsi="Arial" w:cs="Arial"/>
+          <w:sz w:val="18"/>
+          <w:szCs w:val="18"/>
+        </w:rPr>
+        <w:tab/>
+      </w:r>
+      <w:bookmarkStart w:id="8" w:name="FIRMACONTABILIDAD"/>
       <w:bookmarkEnd w:id="8"/>
       <w:r>
         <w:rPr>
@@ -377,15 +426,7 @@
           <w:sz w:val="24"/>
           <w:szCs w:val="24"/>
         </w:rPr>
-        <w:tab/>
-      </w:r>
-      <w:r>
-        <w:rPr>
-          <w:sz w:val="24"/>
-          <w:szCs w:val="24"/>
-        </w:rPr>
-        <w:tab/>
-        <w:t xml:space="preserve">      </w:t>
+        <w:t xml:space="preserve"> </w:t>
       </w:r>
       <w:bookmarkStart w:id="9" w:name="FIRMARESPONSABLEAREA"/>
       <w:bookmarkEnd w:id="9"/>

</xml_diff>